<commit_message>
Limit signature block to a maximum of 3 signatures in a row across live preview, Word DOCX, and PDF
</commit_message>
<xml_diff>
--- a/SGB_Functionality_Audit_2026/02_School_Mission_Statement/SGB_Mission_and_Vision_Statement_2026.docx
+++ b/SGB_Functionality_Audit_2026/02_School_Mission_Statement/SGB_Mission_and_Vision_Statement_2026.docx
@@ -2498,6 +2498,135 @@
               </w:rPr>
               <w:t xml:space="preserve">Date: ____________________</w:t>
             </w:r>
+          </w:p>
+        </w:tc>
+      </w:tr>
+      <w:tr>
+        <w:trPr>
+          <w:cantSplit/>
+        </w:trPr>
+        <w:tc>
+          <w:tcPr>
+            <w:tcW w:type="dxa" w:w="3590"/>
+            <w:tcMar>
+              <w:top w:type="dxa" w:w="120"/>
+              <w:left w:type="dxa" w:w="20"/>
+              <w:bottom w:type="dxa" w:w="40"/>
+              <w:right w:type="dxa" w:w="20"/>
+            </w:tcMar>
+          </w:tcPr>
+          <w:p>
+            <w:pPr>
+              <w:keepLines/>
+              <w:spacing w:after="10" w:before="0"/>
+            </w:pPr>
+            <w:r>
+              <w:rPr>
+                <w:rFonts w:ascii="Aptos" w:cs="Aptos" w:eastAsia="Aptos" w:hAnsi="Aptos"/>
+                <w:color w:val="64748B"/>
+                <w:sz w:val="20"/>
+                <w:szCs w:val="20"/>
+              </w:rPr>
+              <w:t xml:space="preserve">_________________________</w:t>
+            </w:r>
+          </w:p>
+          <w:p>
+            <w:pPr>
+              <w:keepLines/>
+              <w:spacing w:after="40" w:before="0"/>
+            </w:pPr>
+            <w:r>
+              <w:rPr>
+                <w:rFonts w:ascii="Aptos" w:cs="Aptos" w:eastAsia="Aptos" w:hAnsi="Aptos"/>
+                <w:i/>
+                <w:iCs/>
+                <w:color w:val="64748B"/>
+                <w:sz w:val="16"/>
+                <w:szCs w:val="16"/>
+              </w:rPr>
+              <w:t xml:space="preserve">Signature</w:t>
+            </w:r>
+          </w:p>
+          <w:p>
+            <w:pPr>
+              <w:keepLines/>
+              <w:spacing w:after="20" w:before="0"/>
+            </w:pPr>
+            <w:r>
+              <w:rPr>
+                <w:rFonts w:ascii="Aptos" w:cs="Aptos" w:eastAsia="Aptos" w:hAnsi="Aptos"/>
+                <w:b/>
+                <w:bCs/>
+                <w:color w:val="1A1A1A"/>
+                <w:sz w:val="20"/>
+                <w:szCs w:val="20"/>
+              </w:rPr>
+              <w:t xml:space="preserve">____________________</w:t>
+            </w:r>
+          </w:p>
+          <w:p>
+            <w:pPr>
+              <w:keepLines/>
+              <w:spacing w:after="30" w:before="0"/>
+            </w:pPr>
+            <w:r>
+              <w:rPr>
+                <w:rFonts w:ascii="Aptos" w:cs="Aptos" w:eastAsia="Aptos" w:hAnsi="Aptos"/>
+                <w:b/>
+                <w:bCs/>
+                <w:color w:val="0C2340"/>
+                <w:sz w:val="19"/>
+                <w:szCs w:val="19"/>
+              </w:rPr>
+              <w:t xml:space="preserve">SGB Secratary</w:t>
+            </w:r>
+          </w:p>
+          <w:p>
+            <w:pPr>
+              <w:keepLines/>
+              <w:spacing w:after="0" w:before="30"/>
+            </w:pPr>
+            <w:r>
+              <w:rPr>
+                <w:rFonts w:ascii="Aptos" w:cs="Aptos" w:eastAsia="Aptos" w:hAnsi="Aptos"/>
+                <w:color w:val="64748B"/>
+                <w:sz w:val="18"/>
+                <w:szCs w:val="18"/>
+              </w:rPr>
+              <w:t xml:space="preserve">Date: ____________________</w:t>
+            </w:r>
+          </w:p>
+        </w:tc>
+        <w:tc>
+          <w:tcPr>
+            <w:tcW w:type="dxa" w:w="3590"/>
+            <w:tcMar>
+              <w:top w:type="dxa" w:w="0"/>
+              <w:left w:type="dxa" w:w="0"/>
+              <w:bottom w:type="dxa" w:w="0"/>
+              <w:right w:type="dxa" w:w="0"/>
+            </w:tcMar>
+          </w:tcPr>
+          <w:p>
+            <w:pPr>
+              <w:spacing w:after="0" w:before="0"/>
+            </w:pPr>
+          </w:p>
+        </w:tc>
+        <w:tc>
+          <w:tcPr>
+            <w:tcW w:type="dxa" w:w="3590"/>
+            <w:tcMar>
+              <w:top w:type="dxa" w:w="0"/>
+              <w:left w:type="dxa" w:w="0"/>
+              <w:bottom w:type="dxa" w:w="0"/>
+              <w:right w:type="dxa" w:w="0"/>
+            </w:tcMar>
+          </w:tcPr>
+          <w:p>
+            <w:pPr>
+              <w:spacing w:after="0" w:before="0"/>
+            </w:pPr>
           </w:p>
         </w:tc>
       </w:tr>

</xml_diff>

<commit_message>
Right-justify SGB in Word running header, extend signature name underline to right edge, and fix heading/body orphan prevention
</commit_message>
<xml_diff>
--- a/SGB_Functionality_Audit_2026/02_School_Mission_Statement/SGB_Mission_and_Vision_Statement_2026.docx
+++ b/SGB_Functionality_Audit_2026/02_School_Mission_Statement/SGB_Mission_and_Vision_Statement_2026.docx
@@ -2270,6 +2270,9 @@
           </w:p>
           <w:p>
             <w:pPr>
+              <w:tabs>
+                <w:tab w:val="right" w:pos="3081" w:leader="underscore"/>
+              </w:tabs>
               <w:spacing w:after="15" w:before="0"/>
             </w:pPr>
             <w:r>
@@ -2281,16 +2284,7 @@
                 <w:sz w:val="18"/>
                 <w:szCs w:val="18"/>
               </w:rPr>
-              <w:t xml:space="preserve">NAME: </w:t>
-            </w:r>
-            <w:r>
-              <w:rPr>
-                <w:rFonts w:ascii="Aptos" w:cs="Aptos" w:eastAsia="Aptos" w:hAnsi="Aptos"/>
-                <w:color w:val="94A3B8"/>
-                <w:sz w:val="18"/>
-                <w:szCs w:val="18"/>
-              </w:rPr>
-              <w:t xml:space="preserve">______________________</w:t>
+              <w:t xml:space="preserve">NAME:	</w:t>
             </w:r>
           </w:p>
           <w:p>
@@ -2332,7 +2326,7 @@
                 <w:sz w:val="18"/>
                 <w:szCs w:val="18"/>
               </w:rPr>
-              <w:t xml:space="preserve">__________________</w:t>
+              <w:t xml:space="preserve">________________________</w:t>
             </w:r>
           </w:p>
         </w:tc>
@@ -2405,6 +2399,9 @@
           </w:p>
           <w:p>
             <w:pPr>
+              <w:tabs>
+                <w:tab w:val="right" w:pos="3081" w:leader="underscore"/>
+              </w:tabs>
               <w:spacing w:after="15" w:before="0"/>
             </w:pPr>
             <w:r>
@@ -2416,16 +2413,7 @@
                 <w:sz w:val="18"/>
                 <w:szCs w:val="18"/>
               </w:rPr>
-              <w:t xml:space="preserve">NAME: </w:t>
-            </w:r>
-            <w:r>
-              <w:rPr>
-                <w:rFonts w:ascii="Aptos" w:cs="Aptos" w:eastAsia="Aptos" w:hAnsi="Aptos"/>
-                <w:color w:val="94A3B8"/>
-                <w:sz w:val="18"/>
-                <w:szCs w:val="18"/>
-              </w:rPr>
-              <w:t xml:space="preserve">______________________</w:t>
+              <w:t xml:space="preserve">NAME:	</w:t>
             </w:r>
           </w:p>
           <w:p>
@@ -2467,7 +2455,7 @@
                 <w:sz w:val="18"/>
                 <w:szCs w:val="18"/>
               </w:rPr>
-              <w:t xml:space="preserve">__________________</w:t>
+              <w:t xml:space="preserve">________________________</w:t>
             </w:r>
           </w:p>
         </w:tc>
@@ -2540,6 +2528,9 @@
           </w:p>
           <w:p>
             <w:pPr>
+              <w:tabs>
+                <w:tab w:val="right" w:pos="3081" w:leader="underscore"/>
+              </w:tabs>
               <w:spacing w:after="15" w:before="0"/>
             </w:pPr>
             <w:r>
@@ -2551,16 +2542,7 @@
                 <w:sz w:val="18"/>
                 <w:szCs w:val="18"/>
               </w:rPr>
-              <w:t xml:space="preserve">NAME: </w:t>
-            </w:r>
-            <w:r>
-              <w:rPr>
-                <w:rFonts w:ascii="Aptos" w:cs="Aptos" w:eastAsia="Aptos" w:hAnsi="Aptos"/>
-                <w:color w:val="94A3B8"/>
-                <w:sz w:val="18"/>
-                <w:szCs w:val="18"/>
-              </w:rPr>
-              <w:t xml:space="preserve">______________________</w:t>
+              <w:t xml:space="preserve">NAME:	</w:t>
             </w:r>
           </w:p>
           <w:p>
@@ -2602,7 +2584,7 @@
                 <w:sz w:val="18"/>
                 <w:szCs w:val="18"/>
               </w:rPr>
-              <w:t xml:space="preserve">__________________</w:t>
+              <w:t xml:space="preserve">________________________</w:t>
             </w:r>
           </w:p>
         </w:tc>
@@ -2768,6 +2750,9 @@
           </w:p>
           <w:p>
             <w:pPr>
+              <w:tabs>
+                <w:tab w:val="right" w:pos="3081" w:leader="underscore"/>
+              </w:tabs>
               <w:spacing w:after="15" w:before="0"/>
             </w:pPr>
             <w:r>
@@ -2779,16 +2764,7 @@
                 <w:sz w:val="18"/>
                 <w:szCs w:val="18"/>
               </w:rPr>
-              <w:t xml:space="preserve">NAME: </w:t>
-            </w:r>
-            <w:r>
-              <w:rPr>
-                <w:rFonts w:ascii="Aptos" w:cs="Aptos" w:eastAsia="Aptos" w:hAnsi="Aptos"/>
-                <w:color w:val="94A3B8"/>
-                <w:sz w:val="18"/>
-                <w:szCs w:val="18"/>
-              </w:rPr>
-              <w:t xml:space="preserve">______________________</w:t>
+              <w:t xml:space="preserve">NAME:	</w:t>
             </w:r>
           </w:p>
           <w:p>
@@ -2830,7 +2806,7 @@
                 <w:sz w:val="18"/>
                 <w:szCs w:val="18"/>
               </w:rPr>
-              <w:t xml:space="preserve">__________________</w:t>
+              <w:t xml:space="preserve">________________________</w:t>
             </w:r>
           </w:p>
         </w:tc>
@@ -3068,6 +3044,9 @@
       <w:pBdr>
         <w:bottom w:val="single" w:color="CBD5E1" w:sz="6"/>
       </w:pBdr>
+      <w:tabs>
+        <w:tab w:val="right" w:pos="10771"/>
+      </w:tabs>
       <w:spacing w:after="80" w:before="0"/>
     </w:pPr>
     <w:r>

</xml_diff>